<commit_message>
Update AI prompts document with email notifications
</commit_message>
<xml_diff>
--- a/AI_Prompts.docx
+++ b/AI_Prompts.docx
@@ -384,7 +384,7 @@
                 <w:sz w:val="18"/>
                 <w:szCs w:val="18"/>
               </w:rPr>
-              <w:t xml:space="preserve">Backend, frontend and test scripts, one module per prompt (P2 to P7), each run and tested locally before the next prompt.</w:t>
+              <w:t xml:space="preserve">Backend, email notifications, frontend and test scripts, one module per prompt (P2 to P8), each run and tested locally before the next prompt.</w:t>
             </w:r>
           </w:p>
         </w:tc>
@@ -476,7 +476,7 @@
                 <w:sz w:val="18"/>
                 <w:szCs w:val="18"/>
               </w:rPr>
-              <w:t xml:space="preserve">README and .env.example (P8).</w:t>
+              <w:t xml:space="preserve">README and .env.example (P9).</w:t>
             </w:r>
           </w:p>
         </w:tc>
@@ -3411,7 +3411,7 @@
                 <w:sz w:val="18"/>
                 <w:szCs w:val="18"/>
               </w:rPr>
-              <w:t xml:space="preserve">P7  Frontend dashboard</w:t>
+              <w:t xml:space="preserve">P7  Email notifications</w:t>
             </w:r>
           </w:p>
         </w:tc>
@@ -3481,7 +3481,7 @@
                 <w:sz w:val="18"/>
                 <w:szCs w:val="18"/>
               </w:rPr>
-              <w:t xml:space="preserve">You are a front-end engineer who values simple, secure, dependency-free code.</w:t>
+              <w:t xml:space="preserve">You are an experienced backend and automation engineer (5+ years) working with Node.js, Express and MongoDB.</w:t>
             </w:r>
           </w:p>
         </w:tc>
@@ -3549,7 +3549,7 @@
                 <w:sz w:val="18"/>
                 <w:szCs w:val="18"/>
               </w:rPr>
-              <w:t xml:space="preserve">Build a single-page dashboard served by Express from /public (plain HTML, CSS and JavaScript, no framework).</w:t>
+              <w:t xml:space="preserve">Add optional email alerts: when an alert is saved with high or critical severity, email the on-call address with the AI-written message and the supporting facts.</w:t>
             </w:r>
           </w:p>
         </w:tc>
@@ -3618,7 +3618,7 @@
                 <w:sz w:val="18"/>
                 <w:szCs w:val="18"/>
               </w:rPr>
-              <w:t xml:space="preserve">• Statistics cards (total, active, critical/high, resolved) and an alert list sorted by severity, then newest.</w:t>
+              <w:t xml:space="preserve">• Use Nodemailer (current docs, Node 20+) with Gmail SMTP and an App Password; credentials only from SMTP_USER, SMTP_PASS and ALERT_EMAIL_TO. The feature is silently off if any is missing.</w:t>
             </w:r>
           </w:p>
           <w:p>
@@ -3632,7 +3632,7 @@
                 <w:sz w:val="18"/>
                 <w:szCs w:val="18"/>
               </w:rPr>
-              <w:t xml:space="preserve">• Severity colours, AI-generated vs template badge, filter by status and severity, mark-as-resolved button.</w:t>
+              <w:t xml:space="preserve">• Minimum severity configurable via ALERT_EMAIL_MIN_SEVERITY (default high).</w:t>
             </w:r>
           </w:p>
           <w:p>
@@ -3646,7 +3646,7 @@
                 <w:sz w:val="18"/>
                 <w:szCs w:val="18"/>
               </w:rPr>
-              <w:t xml:space="preserve">• Auto-refresh every 15 seconds and a manual refresh button.</w:t>
+              <w:t xml:space="preserve">• Create one reusable transporter with connection, greeting and socket timeouts.</w:t>
             </w:r>
           </w:p>
           <w:p>
@@ -3660,7 +3660,7 @@
                 <w:sz w:val="18"/>
                 <w:szCs w:val="18"/>
               </w:rPr>
-              <w:t xml:space="preserve">• A test panel that posts JSON to /monitor so the whole flow can be demonstrated from the browser.</w:t>
+              <w:t xml:space="preserve">• Never throw: a failed email is logged and must not fail /monitor or lose the alert.</w:t>
             </w:r>
           </w:p>
           <w:p>
@@ -3674,7 +3674,7 @@
                 <w:sz w:val="18"/>
                 <w:szCs w:val="18"/>
               </w:rPr>
-              <w:t xml:space="preserve">• Security: render all API-supplied text with textContent only (never innerHTML) to prevent XSS.</w:t>
+              <w:t xml:space="preserve">• Send emails from an in-memory queue, one at a time, so a large batch cannot open many SMTP connections and /monitor never waits for SMTP (fire-and-forget).</w:t>
             </w:r>
           </w:p>
           <w:p>
@@ -3688,7 +3688,21 @@
                 <w:sz w:val="18"/>
                 <w:szCs w:val="18"/>
               </w:rPr>
-              <w:t xml:space="preserve">• Responsive layout with dark and light themes.</w:t>
+              <w:t xml:space="preserve">• Security: HTML-escape all API-supplied text in the HTML body and strip line breaks from the subject to prevent header injection.</w:t>
+            </w:r>
+          </w:p>
+          <w:p>
+            <w:pPr>
+              <w:spacing w:after="40"/>
+              <w:ind w:left="200" w:hanging="200"/>
+            </w:pPr>
+            <w:r>
+              <w:rPr>
+                <w:rFonts w:ascii="Arial" w:cs="Arial" w:eastAsia="Arial" w:hAnsi="Arial"/>
+                <w:sz w:val="18"/>
+                <w:szCs w:val="18"/>
+              </w:rPr>
+              <w:t xml:space="preserve">• Plain-text and HTML versions; state whether the message came from Gemini or the template fallback.</w:t>
             </w:r>
           </w:p>
         </w:tc>
@@ -3756,7 +3770,7 @@
                 <w:sz w:val="18"/>
                 <w:szCs w:val="18"/>
               </w:rPr>
-              <w:t xml:space="preserve">index.html, styles.css and app.js.</w:t>
+              <w:t xml:space="preserve">src/services/emailService.js, a small integration in monitorService.js right after the alert is stored, and scripts/test-email.js that verifies the SMTP login and sends one test alert.</w:t>
             </w:r>
           </w:p>
         </w:tc>
@@ -3826,7 +3840,7 @@
                 <w:sz w:val="18"/>
                 <w:szCs w:val="18"/>
               </w:rPr>
-              <w:t xml:space="preserve">P8  Documentation</w:t>
+              <w:t xml:space="preserve">P8  Frontend dashboard</w:t>
             </w:r>
           </w:p>
         </w:tc>
@@ -3896,7 +3910,7 @@
                 <w:sz w:val="18"/>
                 <w:szCs w:val="18"/>
               </w:rPr>
-              <w:t xml:space="preserve">You are a technical writer preparing a README for an engineering reviewer.</w:t>
+              <w:t xml:space="preserve">You are a front-end engineer who values simple, secure, dependency-free code.</w:t>
             </w:r>
           </w:p>
         </w:tc>
@@ -3964,7 +3978,7 @@
                 <w:sz w:val="18"/>
                 <w:szCs w:val="18"/>
               </w:rPr>
-              <w:t xml:space="preserve">Write README.md and .env.example for the project.</w:t>
+              <w:t xml:space="preserve">Build a single-page dashboard served by Express from /public (plain HTML, CSS and JavaScript, no framework).</w:t>
             </w:r>
           </w:p>
         </w:tc>
@@ -4033,7 +4047,7 @@
                 <w:sz w:val="18"/>
                 <w:szCs w:val="18"/>
               </w:rPr>
-              <w:t xml:space="preserve">• How it works (rules detect, AI explains, fallback), architecture and folder structure.</w:t>
+              <w:t xml:space="preserve">• Statistics cards (total, active, critical/high, resolved) and an alert list sorted by severity, then newest.</w:t>
             </w:r>
           </w:p>
           <w:p>
@@ -4047,7 +4061,7 @@
                 <w:sz w:val="18"/>
                 <w:szCs w:val="18"/>
               </w:rPr>
-              <w:t xml:space="preserve">• Setup steps, environment variable table, how to run the sample data and tests.</w:t>
+              <w:t xml:space="preserve">• Severity colours, AI-generated vs template badge, filter by status and severity, mark-as-resolved button.</w:t>
             </w:r>
           </w:p>
           <w:p>
@@ -4061,7 +4075,7 @@
                 <w:sz w:val="18"/>
                 <w:szCs w:val="18"/>
               </w:rPr>
-              <w:t xml:space="preserve">• API reference with request/response examples for /monitor, /alerts and resolve.</w:t>
+              <w:t xml:space="preserve">• Auto-refresh every 15 seconds and a manual refresh button.</w:t>
             </w:r>
           </w:p>
           <w:p>
@@ -4075,7 +4089,7 @@
                 <w:sz w:val="18"/>
                 <w:szCs w:val="18"/>
               </w:rPr>
-              <w:t xml:space="preserve">• Detection rules and thresholds table.</w:t>
+              <w:t xml:space="preserve">• A test panel that posts JSON to /monitor so the whole flow can be demonstrated from the browser.</w:t>
             </w:r>
           </w:p>
           <w:p>
@@ -4089,7 +4103,422 @@
                 <w:sz w:val="18"/>
                 <w:szCs w:val="18"/>
               </w:rPr>
-              <w:t xml:space="preserve">• An honest limitations section (no de-duplication, no authentication or rate limiting on /monitor, optional email not implemented).</w:t>
+              <w:t xml:space="preserve">• Security: render all API-supplied text with textContent only (never innerHTML) to prevent XSS.</w:t>
+            </w:r>
+          </w:p>
+          <w:p>
+            <w:pPr>
+              <w:spacing w:after="40"/>
+              <w:ind w:left="200" w:hanging="200"/>
+            </w:pPr>
+            <w:r>
+              <w:rPr>
+                <w:rFonts w:ascii="Arial" w:cs="Arial" w:eastAsia="Arial" w:hAnsi="Arial"/>
+                <w:sz w:val="18"/>
+                <w:szCs w:val="18"/>
+              </w:rPr>
+              <w:t xml:space="preserve">• Responsive layout with dark and light themes.</w:t>
+            </w:r>
+          </w:p>
+        </w:tc>
+      </w:tr>
+      <w:tr>
+        <w:trPr>
+          <w:cantSplit/>
+        </w:trPr>
+        <w:tc>
+          <w:tcPr>
+            <w:tcW w:type="dxa" w:w="1700"/>
+            <w:tcBorders>
+              <w:top w:val="single" w:color="BFBFBF" w:sz="4"/>
+              <w:left w:val="single" w:color="BFBFBF" w:sz="4"/>
+              <w:bottom w:val="single" w:color="BFBFBF" w:sz="4"/>
+              <w:right w:val="single" w:color="BFBFBF" w:sz="4"/>
+            </w:tcBorders>
+            <w:shd w:fill="F2F2F2" w:color="auto" w:val="clear"/>
+            <w:tcMar>
+              <w:top w:type="dxa" w:w="80"/>
+              <w:left w:type="dxa" w:w="100"/>
+              <w:bottom w:type="dxa" w:w="80"/>
+              <w:right w:type="dxa" w:w="100"/>
+            </w:tcMar>
+          </w:tcPr>
+          <w:p>
+            <w:pPr>
+              <w:spacing w:after="60"/>
+            </w:pPr>
+            <w:r>
+              <w:rPr>
+                <w:rFonts w:ascii="Arial" w:cs="Arial" w:eastAsia="Arial" w:hAnsi="Arial"/>
+                <w:b/>
+                <w:bCs/>
+                <w:sz w:val="18"/>
+                <w:szCs w:val="18"/>
+              </w:rPr>
+              <w:t xml:space="preserve">Expected output</w:t>
+            </w:r>
+          </w:p>
+        </w:tc>
+        <w:tc>
+          <w:tcPr>
+            <w:tcW w:type="dxa" w:w="7938"/>
+            <w:tcBorders>
+              <w:top w:val="single" w:color="BFBFBF" w:sz="4"/>
+              <w:left w:val="single" w:color="BFBFBF" w:sz="4"/>
+              <w:bottom w:val="single" w:color="BFBFBF" w:sz="4"/>
+              <w:right w:val="single" w:color="BFBFBF" w:sz="4"/>
+            </w:tcBorders>
+            <w:tcMar>
+              <w:top w:type="dxa" w:w="80"/>
+              <w:left w:type="dxa" w:w="100"/>
+              <w:bottom w:type="dxa" w:w="80"/>
+              <w:right w:type="dxa" w:w="100"/>
+            </w:tcMar>
+          </w:tcPr>
+          <w:p>
+            <w:pPr>
+              <w:spacing w:after="60"/>
+            </w:pPr>
+            <w:r>
+              <w:rPr>
+                <w:rFonts w:ascii="Arial" w:cs="Arial" w:eastAsia="Arial" w:hAnsi="Arial"/>
+                <w:sz w:val="18"/>
+                <w:szCs w:val="18"/>
+              </w:rPr>
+              <w:t xml:space="preserve">index.html, styles.css and app.js.</w:t>
+            </w:r>
+          </w:p>
+        </w:tc>
+      </w:tr>
+    </w:tbl>
+    <w:p>
+      <w:pPr>
+        <w:spacing w:after="120"/>
+      </w:pPr>
+      <w:r>
+        <w:rPr>
+          <w:rFonts w:ascii="Arial" w:cs="Arial" w:eastAsia="Arial" w:hAnsi="Arial"/>
+          <w:sz w:val="20"/>
+          <w:szCs w:val="20"/>
+        </w:rPr>
+        <w:t xml:space="preserve"/>
+      </w:r>
+    </w:p>
+    <w:tbl>
+      <w:tblPr>
+        <w:tblW w:type="dxa" w:w="9638"/>
+        <w:tblBorders>
+          <w:top w:val="single" w:color="auto" w:sz="4"/>
+          <w:left w:val="single" w:color="auto" w:sz="4"/>
+          <w:bottom w:val="single" w:color="auto" w:sz="4"/>
+          <w:right w:val="single" w:color="auto" w:sz="4"/>
+          <w:insideH w:val="single" w:color="auto" w:sz="4"/>
+          <w:insideV w:val="single" w:color="auto" w:sz="4"/>
+        </w:tblBorders>
+      </w:tblPr>
+      <w:tblGrid>
+        <w:gridCol w:w="1700"/>
+        <w:gridCol w:w="7938"/>
+      </w:tblGrid>
+      <w:tr>
+        <w:trPr>
+          <w:cantSplit/>
+        </w:trPr>
+        <w:tc>
+          <w:tcPr>
+            <w:tcW w:type="dxa" w:w="9638"/>
+            <w:gridSpan w:val="2"/>
+            <w:tcBorders>
+              <w:top w:val="single" w:color="BFBFBF" w:sz="4"/>
+              <w:left w:val="single" w:color="BFBFBF" w:sz="4"/>
+              <w:bottom w:val="single" w:color="BFBFBF" w:sz="4"/>
+              <w:right w:val="single" w:color="BFBFBF" w:sz="4"/>
+            </w:tcBorders>
+            <w:shd w:fill="D9E2F3" w:color="auto" w:val="clear"/>
+            <w:tcMar>
+              <w:top w:type="dxa" w:w="80"/>
+              <w:left w:type="dxa" w:w="100"/>
+              <w:bottom w:type="dxa" w:w="80"/>
+              <w:right w:type="dxa" w:w="100"/>
+            </w:tcMar>
+          </w:tcPr>
+          <w:p>
+            <w:pPr>
+              <w:keepNext/>
+              <w:spacing w:after="60"/>
+            </w:pPr>
+            <w:r>
+              <w:rPr>
+                <w:rFonts w:ascii="Arial" w:cs="Arial" w:eastAsia="Arial" w:hAnsi="Arial"/>
+                <w:b/>
+                <w:bCs/>
+                <w:sz w:val="18"/>
+                <w:szCs w:val="18"/>
+              </w:rPr>
+              <w:t xml:space="preserve">P9  Documentation</w:t>
+            </w:r>
+          </w:p>
+        </w:tc>
+      </w:tr>
+      <w:tr>
+        <w:trPr>
+          <w:cantSplit/>
+        </w:trPr>
+        <w:tc>
+          <w:tcPr>
+            <w:tcW w:type="dxa" w:w="1700"/>
+            <w:tcBorders>
+              <w:top w:val="single" w:color="BFBFBF" w:sz="4"/>
+              <w:left w:val="single" w:color="BFBFBF" w:sz="4"/>
+              <w:bottom w:val="single" w:color="BFBFBF" w:sz="4"/>
+              <w:right w:val="single" w:color="BFBFBF" w:sz="4"/>
+            </w:tcBorders>
+            <w:shd w:fill="F2F2F2" w:color="auto" w:val="clear"/>
+            <w:tcMar>
+              <w:top w:type="dxa" w:w="80"/>
+              <w:left w:type="dxa" w:w="100"/>
+              <w:bottom w:type="dxa" w:w="80"/>
+              <w:right w:type="dxa" w:w="100"/>
+            </w:tcMar>
+          </w:tcPr>
+          <w:p>
+            <w:pPr>
+              <w:keepNext/>
+              <w:spacing w:after="60"/>
+            </w:pPr>
+            <w:r>
+              <w:rPr>
+                <w:rFonts w:ascii="Arial" w:cs="Arial" w:eastAsia="Arial" w:hAnsi="Arial"/>
+                <w:b/>
+                <w:bCs/>
+                <w:sz w:val="18"/>
+                <w:szCs w:val="18"/>
+              </w:rPr>
+              <w:t xml:space="preserve">Role</w:t>
+            </w:r>
+          </w:p>
+        </w:tc>
+        <w:tc>
+          <w:tcPr>
+            <w:tcW w:type="dxa" w:w="7938"/>
+            <w:tcBorders>
+              <w:top w:val="single" w:color="BFBFBF" w:sz="4"/>
+              <w:left w:val="single" w:color="BFBFBF" w:sz="4"/>
+              <w:bottom w:val="single" w:color="BFBFBF" w:sz="4"/>
+              <w:right w:val="single" w:color="BFBFBF" w:sz="4"/>
+            </w:tcBorders>
+            <w:tcMar>
+              <w:top w:type="dxa" w:w="80"/>
+              <w:left w:type="dxa" w:w="100"/>
+              <w:bottom w:type="dxa" w:w="80"/>
+              <w:right w:type="dxa" w:w="100"/>
+            </w:tcMar>
+          </w:tcPr>
+          <w:p>
+            <w:pPr>
+              <w:keepNext/>
+              <w:spacing w:after="60"/>
+            </w:pPr>
+            <w:r>
+              <w:rPr>
+                <w:rFonts w:ascii="Arial" w:cs="Arial" w:eastAsia="Arial" w:hAnsi="Arial"/>
+                <w:sz w:val="18"/>
+                <w:szCs w:val="18"/>
+              </w:rPr>
+              <w:t xml:space="preserve">You are a technical writer preparing a README for an engineering reviewer.</w:t>
+            </w:r>
+          </w:p>
+        </w:tc>
+      </w:tr>
+      <w:tr>
+        <w:trPr>
+          <w:cantSplit/>
+        </w:trPr>
+        <w:tc>
+          <w:tcPr>
+            <w:tcW w:type="dxa" w:w="1700"/>
+            <w:tcBorders>
+              <w:top w:val="single" w:color="BFBFBF" w:sz="4"/>
+              <w:left w:val="single" w:color="BFBFBF" w:sz="4"/>
+              <w:bottom w:val="single" w:color="BFBFBF" w:sz="4"/>
+              <w:right w:val="single" w:color="BFBFBF" w:sz="4"/>
+            </w:tcBorders>
+            <w:shd w:fill="F2F2F2" w:color="auto" w:val="clear"/>
+            <w:tcMar>
+              <w:top w:type="dxa" w:w="80"/>
+              <w:left w:type="dxa" w:w="100"/>
+              <w:bottom w:type="dxa" w:w="80"/>
+              <w:right w:type="dxa" w:w="100"/>
+            </w:tcMar>
+          </w:tcPr>
+          <w:p>
+            <w:pPr>
+              <w:spacing w:after="60"/>
+            </w:pPr>
+            <w:r>
+              <w:rPr>
+                <w:rFonts w:ascii="Arial" w:cs="Arial" w:eastAsia="Arial" w:hAnsi="Arial"/>
+                <w:b/>
+                <w:bCs/>
+                <w:sz w:val="18"/>
+                <w:szCs w:val="18"/>
+              </w:rPr>
+              <w:t xml:space="preserve">Task</w:t>
+            </w:r>
+          </w:p>
+        </w:tc>
+        <w:tc>
+          <w:tcPr>
+            <w:tcW w:type="dxa" w:w="7938"/>
+            <w:tcBorders>
+              <w:top w:val="single" w:color="BFBFBF" w:sz="4"/>
+              <w:left w:val="single" w:color="BFBFBF" w:sz="4"/>
+              <w:bottom w:val="single" w:color="BFBFBF" w:sz="4"/>
+              <w:right w:val="single" w:color="BFBFBF" w:sz="4"/>
+            </w:tcBorders>
+            <w:tcMar>
+              <w:top w:type="dxa" w:w="80"/>
+              <w:left w:type="dxa" w:w="100"/>
+              <w:bottom w:type="dxa" w:w="80"/>
+              <w:right w:type="dxa" w:w="100"/>
+            </w:tcMar>
+          </w:tcPr>
+          <w:p>
+            <w:pPr>
+              <w:spacing w:after="60"/>
+            </w:pPr>
+            <w:r>
+              <w:rPr>
+                <w:rFonts w:ascii="Arial" w:cs="Arial" w:eastAsia="Arial" w:hAnsi="Arial"/>
+                <w:sz w:val="18"/>
+                <w:szCs w:val="18"/>
+              </w:rPr>
+              <w:t xml:space="preserve">Write README.md and .env.example for the project.</w:t>
+            </w:r>
+          </w:p>
+        </w:tc>
+      </w:tr>
+      <w:tr>
+        <w:trPr>
+          <w:cantSplit/>
+        </w:trPr>
+        <w:tc>
+          <w:tcPr>
+            <w:tcW w:type="dxa" w:w="1700"/>
+            <w:tcBorders>
+              <w:top w:val="single" w:color="BFBFBF" w:sz="4"/>
+              <w:left w:val="single" w:color="BFBFBF" w:sz="4"/>
+              <w:bottom w:val="single" w:color="BFBFBF" w:sz="4"/>
+              <w:right w:val="single" w:color="BFBFBF" w:sz="4"/>
+            </w:tcBorders>
+            <w:shd w:fill="F2F2F2" w:color="auto" w:val="clear"/>
+            <w:tcMar>
+              <w:top w:type="dxa" w:w="80"/>
+              <w:left w:type="dxa" w:w="100"/>
+              <w:bottom w:type="dxa" w:w="80"/>
+              <w:right w:type="dxa" w:w="100"/>
+            </w:tcMar>
+          </w:tcPr>
+          <w:p>
+            <w:pPr>
+              <w:spacing w:after="60"/>
+            </w:pPr>
+            <w:r>
+              <w:rPr>
+                <w:rFonts w:ascii="Arial" w:cs="Arial" w:eastAsia="Arial" w:hAnsi="Arial"/>
+                <w:b/>
+                <w:bCs/>
+                <w:sz w:val="18"/>
+                <w:szCs w:val="18"/>
+              </w:rPr>
+              <w:t xml:space="preserve">Requirements</w:t>
+            </w:r>
+          </w:p>
+        </w:tc>
+        <w:tc>
+          <w:tcPr>
+            <w:tcW w:type="dxa" w:w="7938"/>
+            <w:tcBorders>
+              <w:top w:val="single" w:color="BFBFBF" w:sz="4"/>
+              <w:left w:val="single" w:color="BFBFBF" w:sz="4"/>
+              <w:bottom w:val="single" w:color="BFBFBF" w:sz="4"/>
+              <w:right w:val="single" w:color="BFBFBF" w:sz="4"/>
+            </w:tcBorders>
+            <w:tcMar>
+              <w:top w:type="dxa" w:w="80"/>
+              <w:left w:type="dxa" w:w="100"/>
+              <w:bottom w:type="dxa" w:w="80"/>
+              <w:right w:type="dxa" w:w="100"/>
+            </w:tcMar>
+          </w:tcPr>
+          <w:p>
+            <w:pPr>
+              <w:spacing w:after="40"/>
+              <w:ind w:left="200" w:hanging="200"/>
+            </w:pPr>
+            <w:r>
+              <w:rPr>
+                <w:rFonts w:ascii="Arial" w:cs="Arial" w:eastAsia="Arial" w:hAnsi="Arial"/>
+                <w:sz w:val="18"/>
+                <w:szCs w:val="18"/>
+              </w:rPr>
+              <w:t xml:space="preserve">• How it works (rules detect, AI explains, fallback), architecture and folder structure.</w:t>
+            </w:r>
+          </w:p>
+          <w:p>
+            <w:pPr>
+              <w:spacing w:after="40"/>
+              <w:ind w:left="200" w:hanging="200"/>
+            </w:pPr>
+            <w:r>
+              <w:rPr>
+                <w:rFonts w:ascii="Arial" w:cs="Arial" w:eastAsia="Arial" w:hAnsi="Arial"/>
+                <w:sz w:val="18"/>
+                <w:szCs w:val="18"/>
+              </w:rPr>
+              <w:t xml:space="preserve">• Setup steps, environment variable table, how to run the sample data and tests.</w:t>
+            </w:r>
+          </w:p>
+          <w:p>
+            <w:pPr>
+              <w:spacing w:after="40"/>
+              <w:ind w:left="200" w:hanging="200"/>
+            </w:pPr>
+            <w:r>
+              <w:rPr>
+                <w:rFonts w:ascii="Arial" w:cs="Arial" w:eastAsia="Arial" w:hAnsi="Arial"/>
+                <w:sz w:val="18"/>
+                <w:szCs w:val="18"/>
+              </w:rPr>
+              <w:t xml:space="preserve">• API reference with request/response examples for /monitor, /alerts and resolve.</w:t>
+            </w:r>
+          </w:p>
+          <w:p>
+            <w:pPr>
+              <w:spacing w:after="40"/>
+              <w:ind w:left="200" w:hanging="200"/>
+            </w:pPr>
+            <w:r>
+              <w:rPr>
+                <w:rFonts w:ascii="Arial" w:cs="Arial" w:eastAsia="Arial" w:hAnsi="Arial"/>
+                <w:sz w:val="18"/>
+                <w:szCs w:val="18"/>
+              </w:rPr>
+              <w:t xml:space="preserve">• Detection rules and thresholds table.</w:t>
+            </w:r>
+          </w:p>
+          <w:p>
+            <w:pPr>
+              <w:spacing w:after="40"/>
+              <w:ind w:left="200" w:hanging="200"/>
+            </w:pPr>
+            <w:r>
+              <w:rPr>
+                <w:rFonts w:ascii="Arial" w:cs="Arial" w:eastAsia="Arial" w:hAnsi="Arial"/>
+                <w:sz w:val="18"/>
+                <w:szCs w:val="18"/>
+              </w:rPr>
+              <w:t xml:space="preserve">• An email notifications section and an honest limitations section (no de-duplication, no authentication or rate limiting on /monitor, in-memory email queue, Gmail limits).</w:t>
             </w:r>
           </w:p>
         </w:tc>
@@ -4404,6 +4833,24 @@
     </w:p>
     <w:p>
       <w:pPr>
+        <w:pStyle w:val="ListParagraph"/>
+        <w:numPr>
+          <w:ilvl w:val="0"/>
+          <w:numId w:val="2"/>
+        </w:numPr>
+        <w:spacing w:after="60"/>
+      </w:pPr>
+      <w:r>
+        <w:rPr>
+          <w:rFonts w:ascii="Arial" w:cs="Arial" w:eastAsia="Arial" w:hAnsi="Arial"/>
+          <w:sz w:val="20"/>
+          <w:szCs w:val="20"/>
+        </w:rPr>
+        <w:t xml:space="preserve">Email goes out only for high and critical alerts, from a one-at-a-time queue that never blocks /monitor and never throws.</w:t>
+      </w:r>
+    </w:p>
+    <w:p>
+      <w:pPr>
         <w:spacing w:before="100"/>
       </w:pPr>
       <w:r>
@@ -4550,7 +4997,7 @@
           <w:sz w:val="20"/>
           <w:szCs w:val="20"/>
         </w:rPr>
-        <w:t xml:space="preserve">Error handling: 11 negative cases (broken JSON, empty array, oversized batch, bad filters, bad id, unknown route) all returned the correct 400/404, never a 500.</w:t>
+        <w:t xml:space="preserve">Email: scripts/test-email.js verifies the SMTP login and delivers a test alert. Posting the sample file then delivered 4 emails (the high and critical alerts); the medium alert correctly sent none.</w:t>
       </w:r>
     </w:p>
     <w:p>
@@ -4568,19 +5015,7 @@
           <w:sz w:val="20"/>
           <w:szCs w:val="20"/>
         </w:rPr>
-        <w:t xml:space="preserve">Security check: .env is git-ignored and no keys appear in the committed files.</w:t>
-      </w:r>
-    </w:p>
-    <w:p>
-      <w:pPr>
-        <w:pStyle w:val="Heading1"/>
-        <w:spacing w:after="120" w:before="280"/>
-      </w:pPr>
-      <w:r>
-        <w:rPr>
-          <w:rFonts w:ascii="Arial" w:cs="Arial" w:eastAsia="Arial" w:hAnsi="Arial"/>
-        </w:rPr>
-        <w:t xml:space="preserve">5. Documentation consulted</w:t>
+        <w:t xml:space="preserve">Error handling: 11 negative cases (broken JSON, empty array, oversized batch, bad filters, bad id, unknown route) all returned the correct 400/404, never a 500.</w:t>
       </w:r>
     </w:p>
     <w:p>
@@ -4598,7 +5033,19 @@
           <w:sz w:val="20"/>
           <w:szCs w:val="20"/>
         </w:rPr>
-        <w:t xml:space="preserve">Express 5 migration guide: expressjs.com/en/guide/migrating-5.html</w:t>
+        <w:t xml:space="preserve">Security check: .env is git-ignored and no keys appear in the committed files.</w:t>
+      </w:r>
+    </w:p>
+    <w:p>
+      <w:pPr>
+        <w:pStyle w:val="Heading1"/>
+        <w:spacing w:after="120" w:before="280"/>
+      </w:pPr>
+      <w:r>
+        <w:rPr>
+          <w:rFonts w:ascii="Arial" w:cs="Arial" w:eastAsia="Arial" w:hAnsi="Arial"/>
+        </w:rPr>
+        <w:t xml:space="preserve">5. Documentation consulted</w:t>
       </w:r>
     </w:p>
     <w:p>
@@ -4616,7 +5063,7 @@
           <w:sz w:val="20"/>
           <w:szCs w:val="20"/>
         </w:rPr>
-        <w:t xml:space="preserve">Mongoose 9 migration and connections guides: mongoosejs.com/docs</w:t>
+        <w:t xml:space="preserve">Express 5 migration guide: expressjs.com/en/guide/migrating-5.html</w:t>
       </w:r>
     </w:p>
     <w:p>
@@ -4634,7 +5081,7 @@
           <w:sz w:val="20"/>
           <w:szCs w:val="20"/>
         </w:rPr>
-        <w:t xml:space="preserve">dotenv: github.com/motdotla/dotenv</w:t>
+        <w:t xml:space="preserve">Mongoose 9 migration and connections guides: mongoosejs.com/docs</w:t>
       </w:r>
     </w:p>
     <w:p>
@@ -4652,7 +5099,7 @@
           <w:sz w:val="20"/>
           <w:szCs w:val="20"/>
         </w:rPr>
-        <w:t xml:space="preserve">Node.js DNS API: nodejs.org/api/dns.html</w:t>
+        <w:t xml:space="preserve">dotenv: github.com/motdotla/dotenv</w:t>
       </w:r>
     </w:p>
     <w:p>
@@ -4670,19 +5117,7 @@
           <w:sz w:val="20"/>
           <w:szCs w:val="20"/>
         </w:rPr>
-        <w:t xml:space="preserve">Gemini API quickstart, models and rate limits: ai.google.dev/gemini-api/docs</w:t>
-      </w:r>
-    </w:p>
-    <w:p>
-      <w:pPr>
-        <w:pStyle w:val="Heading1"/>
-        <w:spacing w:after="120" w:before="280"/>
-      </w:pPr>
-      <w:r>
-        <w:rPr>
-          <w:rFonts w:ascii="Arial" w:cs="Arial" w:eastAsia="Arial" w:hAnsi="Arial"/>
-        </w:rPr>
-        <w:t xml:space="preserve">6. Limitations</w:t>
+        <w:t xml:space="preserve">Nodemailer usage and Gmail guide: nodemailer.com and nodemailer.com/guides/using-gmail</w:t>
       </w:r>
     </w:p>
     <w:p>
@@ -4700,7 +5135,7 @@
           <w:sz w:val="20"/>
           <w:szCs w:val="20"/>
         </w:rPr>
-        <w:t xml:space="preserve">The response-time thresholds (3000 ms warn, 10000 ms critical) are my chosen defaults; the brief gives no numbers. They are configurable in src/config/thresholds.js.</w:t>
+        <w:t xml:space="preserve">Google Account help, app passwords: support.google.com/accounts/answer/185833</w:t>
       </w:r>
     </w:p>
     <w:p>
@@ -4718,7 +5153,7 @@
           <w:sz w:val="20"/>
           <w:szCs w:val="20"/>
         </w:rPr>
-        <w:t xml:space="preserve">The "likely cause" in AI alerts is a hint, not a fact.</w:t>
+        <w:t xml:space="preserve">Node.js DNS API: nodejs.org/api/dns.html</w:t>
       </w:r>
     </w:p>
     <w:p>
@@ -4736,7 +5171,19 @@
           <w:sz w:val="20"/>
           <w:szCs w:val="20"/>
         </w:rPr>
-        <w:t xml:space="preserve">Repeated identical failures create duplicate alerts (no de-duplication yet).</w:t>
+        <w:t xml:space="preserve">Gemini API quickstart, models and rate limits: ai.google.dev/gemini-api/docs</w:t>
+      </w:r>
+    </w:p>
+    <w:p>
+      <w:pPr>
+        <w:pStyle w:val="Heading1"/>
+        <w:spacing w:after="120" w:before="280"/>
+      </w:pPr>
+      <w:r>
+        <w:rPr>
+          <w:rFonts w:ascii="Arial" w:cs="Arial" w:eastAsia="Arial" w:hAnsi="Arial"/>
+        </w:rPr>
+        <w:t xml:space="preserve">6. Limitations</w:t>
       </w:r>
     </w:p>
     <w:p>
@@ -4754,7 +5201,7 @@
           <w:sz w:val="20"/>
           <w:szCs w:val="20"/>
         </w:rPr>
-        <w:t xml:space="preserve">/monitor has no authentication or rate limiting.</w:t>
+        <w:t xml:space="preserve">The response-time thresholds (3000 ms warn, 10000 ms critical) are my chosen defaults; the brief gives no numbers. They are configurable in src/config/thresholds.js.</w:t>
       </w:r>
     </w:p>
     <w:p>
@@ -4772,7 +5219,79 @@
           <w:sz w:val="20"/>
           <w:szCs w:val="20"/>
         </w:rPr>
-        <w:t xml:space="preserve">The optional email notification is not implemented.</w:t>
+        <w:t xml:space="preserve">The "likely cause" in AI alerts is a hint, not a fact.</w:t>
+      </w:r>
+    </w:p>
+    <w:p>
+      <w:pPr>
+        <w:pStyle w:val="ListParagraph"/>
+        <w:numPr>
+          <w:ilvl w:val="0"/>
+          <w:numId w:val="2"/>
+        </w:numPr>
+        <w:spacing w:after="60"/>
+      </w:pPr>
+      <w:r>
+        <w:rPr>
+          <w:rFonts w:ascii="Arial" w:cs="Arial" w:eastAsia="Arial" w:hAnsi="Arial"/>
+          <w:sz w:val="20"/>
+          <w:szCs w:val="20"/>
+        </w:rPr>
+        <w:t xml:space="preserve">Repeated identical failures create duplicate alerts (no de-duplication yet).</w:t>
+      </w:r>
+    </w:p>
+    <w:p>
+      <w:pPr>
+        <w:pStyle w:val="ListParagraph"/>
+        <w:numPr>
+          <w:ilvl w:val="0"/>
+          <w:numId w:val="2"/>
+        </w:numPr>
+        <w:spacing w:after="60"/>
+      </w:pPr>
+      <w:r>
+        <w:rPr>
+          <w:rFonts w:ascii="Arial" w:cs="Arial" w:eastAsia="Arial" w:hAnsi="Arial"/>
+          <w:sz w:val="20"/>
+          <w:szCs w:val="20"/>
+        </w:rPr>
+        <w:t xml:space="preserve">/monitor has no authentication or rate limiting.</w:t>
+      </w:r>
+    </w:p>
+    <w:p>
+      <w:pPr>
+        <w:pStyle w:val="ListParagraph"/>
+        <w:numPr>
+          <w:ilvl w:val="0"/>
+          <w:numId w:val="2"/>
+        </w:numPr>
+        <w:spacing w:after="60"/>
+      </w:pPr>
+      <w:r>
+        <w:rPr>
+          <w:rFonts w:ascii="Arial" w:cs="Arial" w:eastAsia="Arial" w:hAnsi="Arial"/>
+          <w:sz w:val="20"/>
+          <w:szCs w:val="20"/>
+        </w:rPr>
+        <w:t xml:space="preserve">Email uses an in-memory queue, one message at a time (about 4 seconds each). A restart loses queued emails and a large batch is slow. A production system needs a real queue and a transactional provider (SES, SendGrid, Postmark).</w:t>
+      </w:r>
+    </w:p>
+    <w:p>
+      <w:pPr>
+        <w:pStyle w:val="ListParagraph"/>
+        <w:numPr>
+          <w:ilvl w:val="0"/>
+          <w:numId w:val="2"/>
+        </w:numPr>
+        <w:spacing w:after="60"/>
+      </w:pPr>
+      <w:r>
+        <w:rPr>
+          <w:rFonts w:ascii="Arial" w:cs="Arial" w:eastAsia="Arial" w:hAnsi="Arial"/>
+          <w:sz w:val="20"/>
+          <w:szCs w:val="20"/>
+        </w:rPr>
+        <w:t xml:space="preserve">Email is sent for every high or critical alert, so repeated identical failures send repeated emails. Gmail also caps personal accounts at about 500 recipients per day.</w:t>
       </w:r>
     </w:p>
     <w:sectPr>

</xml_diff>